<commit_message>
feat(gdocs_exporter): add addressing standard, module bridges, validator header; reorder module context; add u1 m7 scripts
- gdocs_exporter: parse addressing standard and building from/toward from SP; reorder module context to show learning goals before "The One Thing"; add "Based on student response:" header before validators; flatten validator branch indent; style Visual label as normal (not gray/italic); rename "Options" glossary entry
- tracked_scripts: regenerated u1 m1–m4, m11–m12 docx with updated layout; add new u1 m7 unedited scripts
- config/notion_pages.json: bump u5 m8 path B to v6
- fixes: add generate_unit5_template_excel.py
- settings.local.json: add PowerShell/Select-Object allow entries
</commit_message>
<xml_diff>
--- a/tracked_scripts/u1/m1/exitcheck/Module 1 - Teacher Reviewed Script (comparison reference).docx
+++ b/tracked_scripts/u1/m1/exitcheck/Module 1 - Teacher Reviewed Script (comparison reference).docx
@@ -125,6 +125,48 @@
     </w:p>
     <w:p>
       <w:pPr>
+        <w:spacing w:before="120" w:after="40"/>
+      </w:pPr>
+      <w:r>
+        <w:rPr>
+          <w:rFonts w:ascii="Calibri" w:hAnsi="Calibri"/>
+          <w:b/>
+          <w:i w:val="0"/>
+        </w:rPr>
+        <w:t xml:space="preserve">Building From: </w:t>
+      </w:r>
+      <w:r>
+        <w:rPr>
+          <w:rFonts w:ascii="Calibri" w:hAnsi="Calibri"/>
+          <w:b w:val="0"/>
+          <w:i w:val="0"/>
+        </w:rPr>
+        <w:t>Students created and interpreted single-unit picture graphs and bar graphs. They solved simple comparison problems. However, Grade 2 work was often collaborative (class graphs, physical manipulatives) and may not have emphasized independent interpretation or the specific language of "how many more/fewer."</w:t>
+      </w:r>
+    </w:p>
+    <w:p>
+      <w:pPr>
+        <w:spacing w:before="40" w:after="40"/>
+      </w:pPr>
+      <w:r>
+        <w:rPr>
+          <w:rFonts w:ascii="Calibri" w:hAnsi="Calibri"/>
+          <w:b/>
+          <w:i w:val="0"/>
+        </w:rPr>
+        <w:t xml:space="preserve">Building Toward: </w:t>
+      </w:r>
+      <w:r>
+        <w:rPr>
+          <w:rFonts w:ascii="Calibri" w:hAnsi="Calibri"/>
+          <w:b w:val="0"/>
+          <w:i w:val="0"/>
+        </w:rPr>
+        <w:t>Students will apply their solid 1:1 understanding when M2 introduces the critical concept: each symbol can represent MORE than one item (scaled graphs with 1:2 scale). The "how many more/fewer" language established here carries forward. ---</w:t>
+      </w:r>
+    </w:p>
+    <w:p>
+      <w:pPr>
         <w:spacing w:before="160" w:after="0"/>
       </w:pPr>
     </w:p>
@@ -239,7 +281,7 @@
           <w:b/>
           <w:i w:val="0"/>
         </w:rPr>
-        <w:t xml:space="preserve">• Options:  </w:t>
+        <w:t xml:space="preserve">• Answer option (optional):  </w:t>
       </w:r>
       <w:r>
         <w:rPr>
@@ -249,7 +291,7 @@
           <w:color w:val="6E6E6E"/>
           <w:sz w:val="19"/>
         </w:rPr>
-        <w:t>The available answer choices</w:t>
+        <w:t>The available answer choice, nested under Prompt</w:t>
       </w:r>
     </w:p>
     <w:p>
@@ -390,9 +432,7 @@
         <w:rPr>
           <w:rFonts w:ascii="Calibri" w:hAnsi="Calibri"/>
           <w:b/>
-          <w:i/>
-          <w:color w:val="6E6E6E"/>
-          <w:sz w:val="19"/>
+          <w:i w:val="0"/>
         </w:rPr>
         <w:t xml:space="preserve">Visual: </w:t>
       </w:r>
@@ -400,9 +440,7 @@
         <w:rPr>
           <w:rFonts w:ascii="Calibri" w:hAnsi="Calibri"/>
           <w:b w:val="0"/>
-          <w:i/>
-          <w:color w:val="6E6E6E"/>
-          <w:sz w:val="19"/>
+          <w:i w:val="0"/>
         </w:rPr>
         <w:t>Vertical picture graph appears. Popular Snacks data. Popcorn=5, Pretzels=3, Crackers=7, Fruit=4. Key: each symbol = 1 vote.</w:t>
       </w:r>
@@ -531,7 +569,21 @@
     </w:p>
     <w:p>
       <w:pPr>
-        <w:spacing w:before="60" w:after="20"/>
+        <w:spacing w:before="80" w:after="40"/>
+        <w:ind w:left="0"/>
+      </w:pPr>
+      <w:r>
+        <w:rPr>
+          <w:rFonts w:ascii="Calibri" w:hAnsi="Calibri"/>
+          <w:b/>
+          <w:i w:val="0"/>
+        </w:rPr>
+        <w:t>Based on student response:</w:t>
+      </w:r>
+    </w:p>
+    <w:p>
+      <w:pPr>
+        <w:spacing w:before="40" w:after="20"/>
         <w:ind w:left="0"/>
       </w:pPr>
       <w:r>
@@ -576,8 +628,8 @@
     </w:p>
     <w:p>
       <w:pPr>
-        <w:spacing w:before="60" w:after="20"/>
-        <w:ind w:left="432"/>
+        <w:spacing w:before="40" w:after="20"/>
+        <w:ind w:left="0"/>
       </w:pPr>
       <w:r>
         <w:rPr>
@@ -600,15 +652,13 @@
     <w:p>
       <w:pPr>
         <w:spacing w:before="20" w:after="20"/>
-        <w:ind w:left="720"/>
+        <w:ind w:left="0"/>
       </w:pPr>
       <w:r>
         <w:rPr>
           <w:rFonts w:ascii="Calibri" w:hAnsi="Calibri"/>
           <w:b/>
-          <w:i/>
-          <w:color w:val="6E6E6E"/>
-          <w:sz w:val="19"/>
+          <w:i w:val="0"/>
         </w:rPr>
         <w:t xml:space="preserve">Visual: </w:t>
       </w:r>
@@ -616,9 +666,7 @@
         <w:rPr>
           <w:rFonts w:ascii="Calibri" w:hAnsi="Calibri"/>
           <w:b w:val="0"/>
-          <w:i/>
-          <w:color w:val="6E6E6E"/>
-          <w:sz w:val="19"/>
+          <w:i w:val="0"/>
         </w:rPr>
         <w:t>Highlight Crackers on picture_graph_snacks</w:t>
       </w:r>
@@ -626,7 +674,7 @@
     <w:p>
       <w:pPr>
         <w:spacing w:before="20" w:after="20"/>
-        <w:ind w:left="720"/>
+        <w:ind w:left="0"/>
       </w:pPr>
       <w:r>
         <w:rPr>
@@ -647,8 +695,8 @@
     </w:p>
     <w:p>
       <w:pPr>
-        <w:spacing w:before="60" w:after="20"/>
-        <w:ind w:left="432"/>
+        <w:spacing w:before="40" w:after="20"/>
+        <w:ind w:left="0"/>
       </w:pPr>
       <w:r>
         <w:rPr>
@@ -671,15 +719,13 @@
     <w:p>
       <w:pPr>
         <w:spacing w:before="20" w:after="20"/>
-        <w:ind w:left="720"/>
+        <w:ind w:left="0"/>
       </w:pPr>
       <w:r>
         <w:rPr>
           <w:rFonts w:ascii="Calibri" w:hAnsi="Calibri"/>
           <w:b/>
-          <w:i/>
-          <w:color w:val="6E6E6E"/>
-          <w:sz w:val="19"/>
+          <w:i w:val="0"/>
         </w:rPr>
         <w:t xml:space="preserve">Visual: </w:t>
       </w:r>
@@ -687,9 +733,7 @@
         <w:rPr>
           <w:rFonts w:ascii="Calibri" w:hAnsi="Calibri"/>
           <w:b w:val="0"/>
-          <w:i/>
-          <w:color w:val="6E6E6E"/>
-          <w:sz w:val="19"/>
+          <w:i w:val="0"/>
         </w:rPr>
         <w:t>Highlight Crackers on picture_graph_snacks</w:t>
       </w:r>
@@ -697,7 +741,7 @@
     <w:p>
       <w:pPr>
         <w:spacing w:before="20" w:after="20"/>
-        <w:ind w:left="720"/>
+        <w:ind w:left="0"/>
       </w:pPr>
       <w:r>
         <w:rPr>
@@ -718,8 +762,8 @@
     </w:p>
     <w:p>
       <w:pPr>
-        <w:spacing w:before="60" w:after="20"/>
-        <w:ind w:left="432"/>
+        <w:spacing w:before="40" w:after="20"/>
+        <w:ind w:left="0"/>
       </w:pPr>
       <w:r>
         <w:rPr>
@@ -742,15 +786,13 @@
     <w:p>
       <w:pPr>
         <w:spacing w:before="20" w:after="20"/>
-        <w:ind w:left="720"/>
+        <w:ind w:left="0"/>
       </w:pPr>
       <w:r>
         <w:rPr>
           <w:rFonts w:ascii="Calibri" w:hAnsi="Calibri"/>
           <w:b/>
-          <w:i/>
-          <w:color w:val="6E6E6E"/>
-          <w:sz w:val="19"/>
+          <w:i w:val="0"/>
         </w:rPr>
         <w:t xml:space="preserve">Visual: </w:t>
       </w:r>
@@ -758,9 +800,7 @@
         <w:rPr>
           <w:rFonts w:ascii="Calibri" w:hAnsi="Calibri"/>
           <w:b w:val="0"/>
-          <w:i/>
-          <w:color w:val="6E6E6E"/>
-          <w:sz w:val="19"/>
+          <w:i w:val="0"/>
         </w:rPr>
         <w:t>Highlight Crackers on picture_graph_snacks</w:t>
       </w:r>
@@ -768,7 +808,7 @@
     <w:p>
       <w:pPr>
         <w:spacing w:before="20" w:after="20"/>
-        <w:ind w:left="720"/>
+        <w:ind w:left="0"/>
       </w:pPr>
       <w:r>
         <w:rPr>
@@ -789,8 +829,8 @@
     </w:p>
     <w:p>
       <w:pPr>
-        <w:spacing w:before="60" w:after="20"/>
-        <w:ind w:left="432"/>
+        <w:spacing w:before="40" w:after="20"/>
+        <w:ind w:left="0"/>
       </w:pPr>
       <w:r>
         <w:rPr>
@@ -813,15 +853,13 @@
     <w:p>
       <w:pPr>
         <w:spacing w:before="20" w:after="20"/>
-        <w:ind w:left="720"/>
+        <w:ind w:left="0"/>
       </w:pPr>
       <w:r>
         <w:rPr>
           <w:rFonts w:ascii="Calibri" w:hAnsi="Calibri"/>
           <w:b/>
-          <w:i/>
-          <w:color w:val="6E6E6E"/>
-          <w:sz w:val="19"/>
+          <w:i w:val="0"/>
         </w:rPr>
         <w:t xml:space="preserve">Visual: </w:t>
       </w:r>
@@ -829,9 +867,7 @@
         <w:rPr>
           <w:rFonts w:ascii="Calibri" w:hAnsi="Calibri"/>
           <w:b w:val="0"/>
-          <w:i/>
-          <w:color w:val="6E6E6E"/>
-          <w:sz w:val="19"/>
+          <w:i w:val="0"/>
         </w:rPr>
         <w:t>Crackers column highlights. Each symbol pulses as counted: 1, 2, 3, 4, 5, 6, 7.</w:t>
       </w:r>
@@ -839,7 +875,7 @@
     <w:p>
       <w:pPr>
         <w:spacing w:before="20" w:after="20"/>
-        <w:ind w:left="720"/>
+        <w:ind w:left="0"/>
       </w:pPr>
       <w:r>
         <w:rPr>
@@ -876,9 +912,7 @@
         <w:rPr>
           <w:rFonts w:ascii="Calibri" w:hAnsi="Calibri"/>
           <w:b/>
-          <w:i/>
-          <w:color w:val="6E6E6E"/>
-          <w:sz w:val="19"/>
+          <w:i w:val="0"/>
         </w:rPr>
         <w:t xml:space="preserve">Visual: </w:t>
       </w:r>
@@ -886,9 +920,7 @@
         <w:rPr>
           <w:rFonts w:ascii="Calibri" w:hAnsi="Calibri"/>
           <w:b w:val="0"/>
-          <w:i/>
-          <w:color w:val="6E6E6E"/>
-          <w:sz w:val="19"/>
+          <w:i w:val="0"/>
         </w:rPr>
         <w:t>Horizontal bar graph appears. Favorite Seasons data. Spring=6, Summer=9, Fall=4, Winter=5. Axis marked 0-10 by 1s.</w:t>
       </w:r>
@@ -961,7 +993,21 @@
     </w:p>
     <w:p>
       <w:pPr>
-        <w:spacing w:before="60" w:after="20"/>
+        <w:spacing w:before="80" w:after="40"/>
+        <w:ind w:left="0"/>
+      </w:pPr>
+      <w:r>
+        <w:rPr>
+          <w:rFonts w:ascii="Calibri" w:hAnsi="Calibri"/>
+          <w:b/>
+          <w:i w:val="0"/>
+        </w:rPr>
+        <w:t>Based on student response:</w:t>
+      </w:r>
+    </w:p>
+    <w:p>
+      <w:pPr>
+        <w:spacing w:before="40" w:after="20"/>
         <w:ind w:left="0"/>
       </w:pPr>
       <w:r>
@@ -1006,8 +1052,8 @@
     </w:p>
     <w:p>
       <w:pPr>
-        <w:spacing w:before="60" w:after="20"/>
-        <w:ind w:left="432"/>
+        <w:spacing w:before="40" w:after="20"/>
+        <w:ind w:left="0"/>
       </w:pPr>
       <w:r>
         <w:rPr>
@@ -1030,7 +1076,7 @@
     <w:p>
       <w:pPr>
         <w:spacing w:before="20" w:after="20"/>
-        <w:ind w:left="720"/>
+        <w:ind w:left="0"/>
       </w:pPr>
       <w:r>
         <w:rPr>
@@ -1051,8 +1097,8 @@
     </w:p>
     <w:p>
       <w:pPr>
-        <w:spacing w:before="60" w:after="20"/>
-        <w:ind w:left="432"/>
+        <w:spacing w:before="40" w:after="20"/>
+        <w:ind w:left="0"/>
       </w:pPr>
       <w:r>
         <w:rPr>
@@ -1075,15 +1121,13 @@
     <w:p>
       <w:pPr>
         <w:spacing w:before="20" w:after="20"/>
-        <w:ind w:left="720"/>
+        <w:ind w:left="0"/>
       </w:pPr>
       <w:r>
         <w:rPr>
           <w:rFonts w:ascii="Calibri" w:hAnsi="Calibri"/>
           <w:b/>
-          <w:i/>
-          <w:color w:val="6E6E6E"/>
-          <w:sz w:val="19"/>
+          <w:i w:val="0"/>
         </w:rPr>
         <w:t xml:space="preserve">Visual: </w:t>
       </w:r>
@@ -1091,9 +1135,7 @@
         <w:rPr>
           <w:rFonts w:ascii="Calibri" w:hAnsi="Calibri"/>
           <w:b w:val="0"/>
-          <w:i/>
-          <w:color w:val="6E6E6E"/>
-          <w:sz w:val="19"/>
+          <w:i w:val="0"/>
         </w:rPr>
         <w:t>Highlight Fall on bar_graph_seasons</w:t>
       </w:r>
@@ -1101,7 +1143,7 @@
     <w:p>
       <w:pPr>
         <w:spacing w:before="20" w:after="20"/>
-        <w:ind w:left="720"/>
+        <w:ind w:left="0"/>
       </w:pPr>
       <w:r>
         <w:rPr>
@@ -1122,8 +1164,8 @@
     </w:p>
     <w:p>
       <w:pPr>
-        <w:spacing w:before="60" w:after="20"/>
-        <w:ind w:left="432"/>
+        <w:spacing w:before="40" w:after="20"/>
+        <w:ind w:left="0"/>
       </w:pPr>
       <w:r>
         <w:rPr>
@@ -1146,15 +1188,13 @@
     <w:p>
       <w:pPr>
         <w:spacing w:before="20" w:after="20"/>
-        <w:ind w:left="720"/>
+        <w:ind w:left="0"/>
       </w:pPr>
       <w:r>
         <w:rPr>
           <w:rFonts w:ascii="Calibri" w:hAnsi="Calibri"/>
           <w:b/>
-          <w:i/>
-          <w:color w:val="6E6E6E"/>
-          <w:sz w:val="19"/>
+          <w:i w:val="0"/>
         </w:rPr>
         <w:t xml:space="preserve">Visual: </w:t>
       </w:r>
@@ -1162,9 +1202,7 @@
         <w:rPr>
           <w:rFonts w:ascii="Calibri" w:hAnsi="Calibri"/>
           <w:b w:val="0"/>
-          <w:i/>
-          <w:color w:val="6E6E6E"/>
-          <w:sz w:val="19"/>
+          <w:i w:val="0"/>
         </w:rPr>
         <w:t>Fall bar pulses and highlights, showing it as the shortest at 4 votes</w:t>
       </w:r>
@@ -1172,7 +1210,7 @@
     <w:p>
       <w:pPr>
         <w:spacing w:before="20" w:after="20"/>
-        <w:ind w:left="720"/>
+        <w:ind w:left="0"/>
       </w:pPr>
       <w:r>
         <w:rPr>
@@ -1209,9 +1247,7 @@
         <w:rPr>
           <w:rFonts w:ascii="Calibri" w:hAnsi="Calibri"/>
           <w:b/>
-          <w:i/>
-          <w:color w:val="6E6E6E"/>
-          <w:sz w:val="19"/>
+          <w:i w:val="0"/>
         </w:rPr>
         <w:t xml:space="preserve">Visual: </w:t>
       </w:r>
@@ -1219,9 +1255,7 @@
         <w:rPr>
           <w:rFonts w:ascii="Calibri" w:hAnsi="Calibri"/>
           <w:b w:val="0"/>
-          <w:i/>
-          <w:color w:val="6E6E6E"/>
-          <w:sz w:val="19"/>
+          <w:i w:val="0"/>
         </w:rPr>
         <w:t>Vertical bar graph appears. Books Read This Week data. Ava=8, Ben=5, Cara=6, Dan=3. Axis marked 0-8 by 1s.</w:t>
       </w:r>
@@ -1350,7 +1384,21 @@
     </w:p>
     <w:p>
       <w:pPr>
-        <w:spacing w:before="60" w:after="20"/>
+        <w:spacing w:before="80" w:after="40"/>
+        <w:ind w:left="0"/>
+      </w:pPr>
+      <w:r>
+        <w:rPr>
+          <w:rFonts w:ascii="Calibri" w:hAnsi="Calibri"/>
+          <w:b/>
+          <w:i w:val="0"/>
+        </w:rPr>
+        <w:t>Based on student response:</w:t>
+      </w:r>
+    </w:p>
+    <w:p>
+      <w:pPr>
+        <w:spacing w:before="40" w:after="20"/>
         <w:ind w:left="0"/>
       </w:pPr>
       <w:r>
@@ -1395,8 +1443,8 @@
     </w:p>
     <w:p>
       <w:pPr>
-        <w:spacing w:before="60" w:after="20"/>
-        <w:ind w:left="432"/>
+        <w:spacing w:before="40" w:after="20"/>
+        <w:ind w:left="0"/>
       </w:pPr>
       <w:r>
         <w:rPr>
@@ -1419,15 +1467,13 @@
     <w:p>
       <w:pPr>
         <w:spacing w:before="20" w:after="20"/>
-        <w:ind w:left="720"/>
+        <w:ind w:left="0"/>
       </w:pPr>
       <w:r>
         <w:rPr>
           <w:rFonts w:ascii="Calibri" w:hAnsi="Calibri"/>
           <w:b/>
-          <w:i/>
-          <w:color w:val="6E6E6E"/>
-          <w:sz w:val="19"/>
+          <w:i w:val="0"/>
         </w:rPr>
         <w:t xml:space="preserve">Visual: </w:t>
       </w:r>
@@ -1435,9 +1481,7 @@
         <w:rPr>
           <w:rFonts w:ascii="Calibri" w:hAnsi="Calibri"/>
           <w:b w:val="0"/>
-          <w:i/>
-          <w:color w:val="6E6E6E"/>
-          <w:sz w:val="19"/>
+          <w:i w:val="0"/>
         </w:rPr>
         <w:t>Highlight Ava, Dan on bar_graph_books</w:t>
       </w:r>
@@ -1445,7 +1489,7 @@
     <w:p>
       <w:pPr>
         <w:spacing w:before="20" w:after="20"/>
-        <w:ind w:left="720"/>
+        <w:ind w:left="0"/>
       </w:pPr>
       <w:r>
         <w:rPr>
@@ -1466,8 +1510,8 @@
     </w:p>
     <w:p>
       <w:pPr>
-        <w:spacing w:before="60" w:after="20"/>
-        <w:ind w:left="432"/>
+        <w:spacing w:before="40" w:after="20"/>
+        <w:ind w:left="0"/>
       </w:pPr>
       <w:r>
         <w:rPr>
@@ -1490,15 +1534,13 @@
     <w:p>
       <w:pPr>
         <w:spacing w:before="20" w:after="20"/>
-        <w:ind w:left="720"/>
+        <w:ind w:left="0"/>
       </w:pPr>
       <w:r>
         <w:rPr>
           <w:rFonts w:ascii="Calibri" w:hAnsi="Calibri"/>
           <w:b/>
-          <w:i/>
-          <w:color w:val="6E6E6E"/>
-          <w:sz w:val="19"/>
+          <w:i w:val="0"/>
         </w:rPr>
         <w:t xml:space="preserve">Visual: </w:t>
       </w:r>
@@ -1506,9 +1548,7 @@
         <w:rPr>
           <w:rFonts w:ascii="Calibri" w:hAnsi="Calibri"/>
           <w:b w:val="0"/>
-          <w:i/>
-          <w:color w:val="6E6E6E"/>
-          <w:sz w:val="19"/>
+          <w:i w:val="0"/>
         </w:rPr>
         <w:t>Highlight Ava, Dan on bar_graph_books</w:t>
       </w:r>
@@ -1516,7 +1556,7 @@
     <w:p>
       <w:pPr>
         <w:spacing w:before="20" w:after="20"/>
-        <w:ind w:left="720"/>
+        <w:ind w:left="0"/>
       </w:pPr>
       <w:r>
         <w:rPr>
@@ -1537,8 +1577,8 @@
     </w:p>
     <w:p>
       <w:pPr>
-        <w:spacing w:before="60" w:after="20"/>
-        <w:ind w:left="432"/>
+        <w:spacing w:before="40" w:after="20"/>
+        <w:ind w:left="0"/>
       </w:pPr>
       <w:r>
         <w:rPr>
@@ -1561,15 +1601,13 @@
     <w:p>
       <w:pPr>
         <w:spacing w:before="20" w:after="20"/>
-        <w:ind w:left="720"/>
+        <w:ind w:left="0"/>
       </w:pPr>
       <w:r>
         <w:rPr>
           <w:rFonts w:ascii="Calibri" w:hAnsi="Calibri"/>
           <w:b/>
-          <w:i/>
-          <w:color w:val="6E6E6E"/>
-          <w:sz w:val="19"/>
+          <w:i w:val="0"/>
         </w:rPr>
         <w:t xml:space="preserve">Visual: </w:t>
       </w:r>
@@ -1577,9 +1615,7 @@
         <w:rPr>
           <w:rFonts w:ascii="Calibri" w:hAnsi="Calibri"/>
           <w:b w:val="0"/>
-          <w:i/>
-          <w:color w:val="6E6E6E"/>
-          <w:sz w:val="19"/>
+          <w:i w:val="0"/>
         </w:rPr>
         <w:t>Highlight Ava, Dan on bar_graph_books</w:t>
       </w:r>
@@ -1587,7 +1623,7 @@
     <w:p>
       <w:pPr>
         <w:spacing w:before="20" w:after="20"/>
-        <w:ind w:left="720"/>
+        <w:ind w:left="0"/>
       </w:pPr>
       <w:r>
         <w:rPr>
@@ -1608,8 +1644,8 @@
     </w:p>
     <w:p>
       <w:pPr>
-        <w:spacing w:before="60" w:after="20"/>
-        <w:ind w:left="432"/>
+        <w:spacing w:before="40" w:after="20"/>
+        <w:ind w:left="0"/>
       </w:pPr>
       <w:r>
         <w:rPr>
@@ -1632,15 +1668,13 @@
     <w:p>
       <w:pPr>
         <w:spacing w:before="20" w:after="20"/>
-        <w:ind w:left="720"/>
+        <w:ind w:left="0"/>
       </w:pPr>
       <w:r>
         <w:rPr>
           <w:rFonts w:ascii="Calibri" w:hAnsi="Calibri"/>
           <w:b/>
-          <w:i/>
-          <w:color w:val="6E6E6E"/>
-          <w:sz w:val="19"/>
+          <w:i w:val="0"/>
         </w:rPr>
         <w:t xml:space="preserve">Visual: </w:t>
       </w:r>
@@ -1648,9 +1682,7 @@
         <w:rPr>
           <w:rFonts w:ascii="Calibri" w:hAnsi="Calibri"/>
           <w:b w:val="0"/>
-          <w:i/>
-          <w:color w:val="6E6E6E"/>
-          <w:sz w:val="19"/>
+          <w:i w:val="0"/>
         </w:rPr>
         <w:t>Animation highlights Ava's bar at 8 and Dan's bar at 3, then visually shows the 5-unit difference between them</w:t>
       </w:r>
@@ -1658,7 +1690,7 @@
     <w:p>
       <w:pPr>
         <w:spacing w:before="20" w:after="20"/>
-        <w:ind w:left="720"/>
+        <w:ind w:left="0"/>
       </w:pPr>
       <w:r>
         <w:rPr>
@@ -1810,7 +1842,21 @@
     </w:p>
     <w:p>
       <w:pPr>
-        <w:spacing w:before="60" w:after="20"/>
+        <w:spacing w:before="80" w:after="40"/>
+        <w:ind w:left="0"/>
+      </w:pPr>
+      <w:r>
+        <w:rPr>
+          <w:rFonts w:ascii="Calibri" w:hAnsi="Calibri"/>
+          <w:b/>
+          <w:i w:val="0"/>
+        </w:rPr>
+        <w:t>Based on student response:</w:t>
+      </w:r>
+    </w:p>
+    <w:p>
+      <w:pPr>
+        <w:spacing w:before="40" w:after="20"/>
         <w:ind w:left="0"/>
       </w:pPr>
       <w:r>
@@ -1855,8 +1901,8 @@
     </w:p>
     <w:p>
       <w:pPr>
-        <w:spacing w:before="60" w:after="20"/>
-        <w:ind w:left="432"/>
+        <w:spacing w:before="40" w:after="20"/>
+        <w:ind w:left="0"/>
       </w:pPr>
       <w:r>
         <w:rPr>
@@ -1879,15 +1925,13 @@
     <w:p>
       <w:pPr>
         <w:spacing w:before="20" w:after="20"/>
-        <w:ind w:left="720"/>
+        <w:ind w:left="0"/>
       </w:pPr>
       <w:r>
         <w:rPr>
           <w:rFonts w:ascii="Calibri" w:hAnsi="Calibri"/>
           <w:b/>
-          <w:i/>
-          <w:color w:val="6E6E6E"/>
-          <w:sz w:val="19"/>
+          <w:i w:val="0"/>
         </w:rPr>
         <w:t xml:space="preserve">Visual: </w:t>
       </w:r>
@@ -1895,9 +1939,7 @@
         <w:rPr>
           <w:rFonts w:ascii="Calibri" w:hAnsi="Calibri"/>
           <w:b w:val="0"/>
-          <w:i/>
-          <w:color w:val="6E6E6E"/>
-          <w:sz w:val="19"/>
+          <w:i w:val="0"/>
         </w:rPr>
         <w:t>Highlight Ben, Cara on bar_graph_books</w:t>
       </w:r>
@@ -1905,7 +1947,7 @@
     <w:p>
       <w:pPr>
         <w:spacing w:before="20" w:after="20"/>
-        <w:ind w:left="720"/>
+        <w:ind w:left="0"/>
       </w:pPr>
       <w:r>
         <w:rPr>
@@ -1926,8 +1968,8 @@
     </w:p>
     <w:p>
       <w:pPr>
-        <w:spacing w:before="60" w:after="20"/>
-        <w:ind w:left="432"/>
+        <w:spacing w:before="40" w:after="20"/>
+        <w:ind w:left="0"/>
       </w:pPr>
       <w:r>
         <w:rPr>
@@ -1950,15 +1992,13 @@
     <w:p>
       <w:pPr>
         <w:spacing w:before="20" w:after="20"/>
-        <w:ind w:left="720"/>
+        <w:ind w:left="0"/>
       </w:pPr>
       <w:r>
         <w:rPr>
           <w:rFonts w:ascii="Calibri" w:hAnsi="Calibri"/>
           <w:b/>
-          <w:i/>
-          <w:color w:val="6E6E6E"/>
-          <w:sz w:val="19"/>
+          <w:i w:val="0"/>
         </w:rPr>
         <w:t xml:space="preserve">Visual: </w:t>
       </w:r>
@@ -1966,9 +2006,7 @@
         <w:rPr>
           <w:rFonts w:ascii="Calibri" w:hAnsi="Calibri"/>
           <w:b w:val="0"/>
-          <w:i/>
-          <w:color w:val="6E6E6E"/>
-          <w:sz w:val="19"/>
+          <w:i w:val="0"/>
         </w:rPr>
         <w:t>Highlight Ben, Cara on bar_graph_books</w:t>
       </w:r>
@@ -1976,7 +2014,7 @@
     <w:p>
       <w:pPr>
         <w:spacing w:before="20" w:after="20"/>
-        <w:ind w:left="720"/>
+        <w:ind w:left="0"/>
       </w:pPr>
       <w:r>
         <w:rPr>
@@ -1997,8 +2035,8 @@
     </w:p>
     <w:p>
       <w:pPr>
-        <w:spacing w:before="60" w:after="20"/>
-        <w:ind w:left="432"/>
+        <w:spacing w:before="40" w:after="20"/>
+        <w:ind w:left="0"/>
       </w:pPr>
       <w:r>
         <w:rPr>
@@ -2021,15 +2059,13 @@
     <w:p>
       <w:pPr>
         <w:spacing w:before="20" w:after="20"/>
-        <w:ind w:left="720"/>
+        <w:ind w:left="0"/>
       </w:pPr>
       <w:r>
         <w:rPr>
           <w:rFonts w:ascii="Calibri" w:hAnsi="Calibri"/>
           <w:b/>
-          <w:i/>
-          <w:color w:val="6E6E6E"/>
-          <w:sz w:val="19"/>
+          <w:i w:val="0"/>
         </w:rPr>
         <w:t xml:space="preserve">Visual: </w:t>
       </w:r>
@@ -2037,9 +2073,7 @@
         <w:rPr>
           <w:rFonts w:ascii="Calibri" w:hAnsi="Calibri"/>
           <w:b w:val="0"/>
-          <w:i/>
-          <w:color w:val="6E6E6E"/>
-          <w:sz w:val="19"/>
+          <w:i w:val="0"/>
         </w:rPr>
         <w:t>Highlight Ben, Cara on bar_graph_books</w:t>
       </w:r>
@@ -2047,7 +2081,7 @@
     <w:p>
       <w:pPr>
         <w:spacing w:before="20" w:after="20"/>
-        <w:ind w:left="720"/>
+        <w:ind w:left="0"/>
       </w:pPr>
       <w:r>
         <w:rPr>
@@ -2068,8 +2102,8 @@
     </w:p>
     <w:p>
       <w:pPr>
-        <w:spacing w:before="60" w:after="20"/>
-        <w:ind w:left="432"/>
+        <w:spacing w:before="40" w:after="20"/>
+        <w:ind w:left="0"/>
       </w:pPr>
       <w:r>
         <w:rPr>
@@ -2092,15 +2126,13 @@
     <w:p>
       <w:pPr>
         <w:spacing w:before="20" w:after="20"/>
-        <w:ind w:left="720"/>
+        <w:ind w:left="0"/>
       </w:pPr>
       <w:r>
         <w:rPr>
           <w:rFonts w:ascii="Calibri" w:hAnsi="Calibri"/>
           <w:b/>
-          <w:i/>
-          <w:color w:val="6E6E6E"/>
-          <w:sz w:val="19"/>
+          <w:i w:val="0"/>
         </w:rPr>
         <w:t xml:space="preserve">Visual: </w:t>
       </w:r>
@@ -2108,9 +2140,7 @@
         <w:rPr>
           <w:rFonts w:ascii="Calibri" w:hAnsi="Calibri"/>
           <w:b w:val="0"/>
-          <w:i/>
-          <w:color w:val="6E6E6E"/>
-          <w:sz w:val="19"/>
+          <w:i w:val="0"/>
         </w:rPr>
         <w:t>Ben and Cara bars highlight. Ben's bar labeled 5, Cara's bar labeled 6. Addition equation 5 + 6 = 11 appears.</w:t>
       </w:r>
@@ -2118,7 +2148,7 @@
     <w:p>
       <w:pPr>
         <w:spacing w:before="20" w:after="20"/>
-        <w:ind w:left="720"/>
+        <w:ind w:left="0"/>
       </w:pPr>
       <w:r>
         <w:rPr>

</xml_diff>